<commit_message>
Add 12-cubicle scenario boards, large SOC dashboard wall, and 300-DPI paper export suite
</commit_message>
<xml_diff>
--- a/GECOv6/04_PAPER/GECOv6_Manuscript.docx
+++ b/GECOv6/04_PAPER/GECOv6_Manuscript.docx
@@ -11072,7 +11072,7 @@
         <w:rPr>
           <w:color w:val="000000"/>
         </w:rPr>
-        <w:t xml:space="preserve">Author and Funding Statements</w:t>
+        <w:t xml:space="preserve">Author, Funding and AI-Use Statements — Team Completion Required</w:t>
       </w:r>
     </w:p>
     <w:p>
@@ -11114,7 +11114,7 @@
         <w:rPr>
           <w:color w:val="000000"/>
         </w:rPr>
-        <w:t xml:space="preserve">Research workflow, simulation verification, and manuscript preparation were executed using deterministic reproducibility scripts.</w:t>
+        <w:t xml:space="preserve">Proposed disclosure for team confirmation: OpenAI Codex assisted with literature organization and source checking, implementation and analysis drafting, figure/media preparation, and manuscript drafting and revision. Exact available tool/runtime information and verification records are retained in the accompanying package; unavailable model metadata are not inferred. Synthetic narration is identified in the video. The team must state the actual human verification, corrections, responsibility and final approval before submission. This pending statement does not assert that those approvals have already occurred.</w:t>
       </w:r>
     </w:p>
     <w:bookmarkEnd w:id="40"/>
@@ -12358,7 +12358,7 @@
         <w:rPr>
           <w:color w:val="000000"/>
         </w:rPr>
-        <w:t xml:space="preserve">Submission and Peer Review Policies</w:t>
+        <w:t xml:space="preserve">Submission and Peer Review Policies — AI-Generated Content</w:t>
       </w:r>
       <w:r>
         <w:rPr>

</xml_diff>